<commit_message>
Update lab work os
</commit_message>
<xml_diff>
--- a/BIM 4th Sem/OS/Miscellaneous/Lab_3_4_5.docx
+++ b/BIM 4th Sem/OS/Miscellaneous/Lab_3_4_5.docx
@@ -3,8 +3,1299 @@
 <w:document xmlns:wpc="http://schemas.microsoft.com/office/word/2010/wordprocessingCanvas" xmlns:cx="http://schemas.microsoft.com/office/drawing/2014/chartex" xmlns:mc="http://schemas.openxmlformats.org/markup-compatibility/2006" xmlns:o="urn:schemas-microsoft-com:office:office" xmlns:r="http://schemas.openxmlformats.org/officeDocument/2006/relationships" xmlns:m="http://schemas.openxmlformats.org/officeDocument/2006/math" xmlns:v="urn:schemas-microsoft-com:vml" xmlns:wp14="http://schemas.microsoft.com/office/word/2010/wordprocessingDrawing" xmlns:wp="http://schemas.openxmlformats.org/drawingml/2006/wordprocessingDrawing" xmlns:w10="urn:schemas-microsoft-com:office:word" xmlns:w="http://schemas.openxmlformats.org/wordprocessingml/2006/main" xmlns:w14="http://schemas.microsoft.com/office/word/2010/wordml" xmlns:w15="http://schemas.microsoft.com/office/word/2012/wordml" xmlns:w16se="http://schemas.microsoft.com/office/word/2015/wordml/symex" xmlns:wpg="http://schemas.microsoft.com/office/word/2010/wordprocessingGroup" xmlns:wpi="http://schemas.microsoft.com/office/word/2010/wordprocessingInk" xmlns:wne="http://schemas.microsoft.com/office/word/2006/wordml" xmlns:wps="http://schemas.microsoft.com/office/word/2010/wordprocessingShape" mc:Ignorable="w14 w15 w16se wp14">
   <w:body>
     <w:p>
+      <w:r>
+        <w:rPr>
+          <w:noProof/>
+        </w:rPr>
+        <w:drawing>
+          <wp:anchor distT="0" distB="0" distL="114300" distR="114300" simplePos="0" relativeHeight="251658240" behindDoc="0" locked="0" layoutInCell="1" allowOverlap="1" wp14:anchorId="15E51AEB" wp14:editId="11466A0A">
+            <wp:simplePos x="0" y="0"/>
+            <wp:positionH relativeFrom="column">
+              <wp:posOffset>-409575</wp:posOffset>
+            </wp:positionH>
+            <wp:positionV relativeFrom="paragraph">
+              <wp:posOffset>-590550</wp:posOffset>
+            </wp:positionV>
+            <wp:extent cx="3524250" cy="2686050"/>
+            <wp:effectExtent l="0" t="0" r="0" b="0"/>
+            <wp:wrapNone/>
+            <wp:docPr id="6" name="Picture 6" descr="C:\Users\Students\Documents\GitHub\College_Lab_Works_BIM\BIM 4th Sem\OS\Lab_3\Output\banker.png"/>
+            <wp:cNvGraphicFramePr>
+              <a:graphicFrameLocks xmlns:a="http://schemas.openxmlformats.org/drawingml/2006/main" noChangeAspect="1"/>
+            </wp:cNvGraphicFramePr>
+            <a:graphic xmlns:a="http://schemas.openxmlformats.org/drawingml/2006/main">
+              <a:graphicData uri="http://schemas.openxmlformats.org/drawingml/2006/picture">
+                <pic:pic xmlns:pic="http://schemas.openxmlformats.org/drawingml/2006/picture">
+                  <pic:nvPicPr>
+                    <pic:cNvPr id="0" name="Picture 6" descr="C:\Users\Students\Documents\GitHub\College_Lab_Works_BIM\BIM 4th Sem\OS\Lab_3\Output\banker.png"/>
+                    <pic:cNvPicPr>
+                      <a:picLocks noChangeAspect="1" noChangeArrowheads="1"/>
+                    </pic:cNvPicPr>
+                  </pic:nvPicPr>
+                  <pic:blipFill>
+                    <a:blip r:embed="rId6">
+                      <a:extLst>
+                        <a:ext uri="{28A0092B-C50C-407E-A947-70E740481C1C}">
+                          <a14:useLocalDpi xmlns:a14="http://schemas.microsoft.com/office/drawing/2010/main" val="0"/>
+                        </a:ext>
+                      </a:extLst>
+                    </a:blip>
+                    <a:srcRect/>
+                    <a:stretch>
+                      <a:fillRect/>
+                    </a:stretch>
+                  </pic:blipFill>
+                  <pic:spPr bwMode="auto">
+                    <a:xfrm>
+                      <a:off x="0" y="0"/>
+                      <a:ext cx="3524250" cy="2686050"/>
+                    </a:xfrm>
+                    <a:prstGeom prst="rect">
+                      <a:avLst/>
+                    </a:prstGeom>
+                    <a:noFill/>
+                    <a:ln>
+                      <a:noFill/>
+                    </a:ln>
+                  </pic:spPr>
+                </pic:pic>
+              </a:graphicData>
+            </a:graphic>
+            <wp14:sizeRelH relativeFrom="page">
+              <wp14:pctWidth>0</wp14:pctWidth>
+            </wp14:sizeRelH>
+            <wp14:sizeRelV relativeFrom="page">
+              <wp14:pctHeight>0</wp14:pctHeight>
+            </wp14:sizeRelV>
+          </wp:anchor>
+        </w:drawing>
+      </w:r>
+    </w:p>
+    <w:p>
+      <w:r>
+        <w:rPr>
+          <w:noProof/>
+        </w:rPr>
+        <w:drawing>
+          <wp:anchor distT="0" distB="0" distL="114300" distR="114300" simplePos="0" relativeHeight="251659264" behindDoc="0" locked="0" layoutInCell="1" allowOverlap="1" wp14:anchorId="67CC7EF0" wp14:editId="2B2EBA9E">
+            <wp:simplePos x="0" y="0"/>
+            <wp:positionH relativeFrom="page">
+              <wp:posOffset>466725</wp:posOffset>
+            </wp:positionH>
+            <wp:positionV relativeFrom="paragraph">
+              <wp:posOffset>4438650</wp:posOffset>
+            </wp:positionV>
+            <wp:extent cx="5553075" cy="2933700"/>
+            <wp:effectExtent l="0" t="0" r="9525" b="0"/>
+            <wp:wrapNone/>
+            <wp:docPr id="5" name="Picture 5" descr="C:\Users\Students\Documents\GitHub\College_Lab_Works_BIM\BIM 4th Sem\OS\Lab_3\Output\shortest_job.png"/>
+            <wp:cNvGraphicFramePr>
+              <a:graphicFrameLocks xmlns:a="http://schemas.openxmlformats.org/drawingml/2006/main" noChangeAspect="1"/>
+            </wp:cNvGraphicFramePr>
+            <a:graphic xmlns:a="http://schemas.openxmlformats.org/drawingml/2006/main">
+              <a:graphicData uri="http://schemas.openxmlformats.org/drawingml/2006/picture">
+                <pic:pic xmlns:pic="http://schemas.openxmlformats.org/drawingml/2006/picture">
+                  <pic:nvPicPr>
+                    <pic:cNvPr id="0" name="Picture 5" descr="C:\Users\Students\Documents\GitHub\College_Lab_Works_BIM\BIM 4th Sem\OS\Lab_3\Output\shortest_job.png"/>
+                    <pic:cNvPicPr>
+                      <a:picLocks noChangeAspect="1" noChangeArrowheads="1"/>
+                    </pic:cNvPicPr>
+                  </pic:nvPicPr>
+                  <pic:blipFill>
+                    <a:blip r:embed="rId7">
+                      <a:extLst>
+                        <a:ext uri="{28A0092B-C50C-407E-A947-70E740481C1C}">
+                          <a14:useLocalDpi xmlns:a14="http://schemas.microsoft.com/office/drawing/2010/main" val="0"/>
+                        </a:ext>
+                      </a:extLst>
+                    </a:blip>
+                    <a:srcRect/>
+                    <a:stretch>
+                      <a:fillRect/>
+                    </a:stretch>
+                  </pic:blipFill>
+                  <pic:spPr bwMode="auto">
+                    <a:xfrm>
+                      <a:off x="0" y="0"/>
+                      <a:ext cx="5553075" cy="2933700"/>
+                    </a:xfrm>
+                    <a:prstGeom prst="rect">
+                      <a:avLst/>
+                    </a:prstGeom>
+                    <a:noFill/>
+                    <a:ln>
+                      <a:noFill/>
+                    </a:ln>
+                  </pic:spPr>
+                </pic:pic>
+              </a:graphicData>
+            </a:graphic>
+            <wp14:sizeRelH relativeFrom="page">
+              <wp14:pctWidth>0</wp14:pctWidth>
+            </wp14:sizeRelH>
+            <wp14:sizeRelV relativeFrom="page">
+              <wp14:pctHeight>0</wp14:pctHeight>
+            </wp14:sizeRelV>
+          </wp:anchor>
+        </w:drawing>
+      </w:r>
+      <w:r>
+        <w:rPr>
+          <w:noProof/>
+        </w:rPr>
+        <w:drawing>
+          <wp:anchor distT="0" distB="0" distL="114300" distR="114300" simplePos="0" relativeHeight="251662336" behindDoc="0" locked="0" layoutInCell="1" allowOverlap="1" wp14:anchorId="50305BA7" wp14:editId="6A39016A">
+            <wp:simplePos x="0" y="0"/>
+            <wp:positionH relativeFrom="column">
+              <wp:posOffset>-428625</wp:posOffset>
+            </wp:positionH>
+            <wp:positionV relativeFrom="paragraph">
+              <wp:posOffset>1962150</wp:posOffset>
+            </wp:positionV>
+            <wp:extent cx="5572125" cy="2247900"/>
+            <wp:effectExtent l="0" t="0" r="9525" b="0"/>
+            <wp:wrapNone/>
+            <wp:docPr id="4" name="Picture 4" descr="C:\Users\Students\Documents\GitHub\College_Lab_Works_BIM\BIM 4th Sem\OS\Lab_3\Output\round_robin.png"/>
+            <wp:cNvGraphicFramePr>
+              <a:graphicFrameLocks xmlns:a="http://schemas.openxmlformats.org/drawingml/2006/main" noChangeAspect="1"/>
+            </wp:cNvGraphicFramePr>
+            <a:graphic xmlns:a="http://schemas.openxmlformats.org/drawingml/2006/main">
+              <a:graphicData uri="http://schemas.openxmlformats.org/drawingml/2006/picture">
+                <pic:pic xmlns:pic="http://schemas.openxmlformats.org/drawingml/2006/picture">
+                  <pic:nvPicPr>
+                    <pic:cNvPr id="0" name="Picture 4" descr="C:\Users\Students\Documents\GitHub\College_Lab_Works_BIM\BIM 4th Sem\OS\Lab_3\Output\round_robin.png"/>
+                    <pic:cNvPicPr>
+                      <a:picLocks noChangeAspect="1" noChangeArrowheads="1"/>
+                    </pic:cNvPicPr>
+                  </pic:nvPicPr>
+                  <pic:blipFill>
+                    <a:blip r:embed="rId8">
+                      <a:extLst>
+                        <a:ext uri="{28A0092B-C50C-407E-A947-70E740481C1C}">
+                          <a14:useLocalDpi xmlns:a14="http://schemas.microsoft.com/office/drawing/2010/main" val="0"/>
+                        </a:ext>
+                      </a:extLst>
+                    </a:blip>
+                    <a:srcRect/>
+                    <a:stretch>
+                      <a:fillRect/>
+                    </a:stretch>
+                  </pic:blipFill>
+                  <pic:spPr bwMode="auto">
+                    <a:xfrm>
+                      <a:off x="0" y="0"/>
+                      <a:ext cx="5572125" cy="2247900"/>
+                    </a:xfrm>
+                    <a:prstGeom prst="rect">
+                      <a:avLst/>
+                    </a:prstGeom>
+                    <a:noFill/>
+                    <a:ln>
+                      <a:noFill/>
+                    </a:ln>
+                  </pic:spPr>
+                </pic:pic>
+              </a:graphicData>
+            </a:graphic>
+            <wp14:sizeRelH relativeFrom="page">
+              <wp14:pctWidth>0</wp14:pctWidth>
+            </wp14:sizeRelH>
+            <wp14:sizeRelV relativeFrom="page">
+              <wp14:pctHeight>0</wp14:pctHeight>
+            </wp14:sizeRelV>
+          </wp:anchor>
+        </w:drawing>
+      </w:r>
+      <w:r>
+        <w:br w:type="page"/>
+      </w:r>
+    </w:p>
+    <w:p>
+      <w:r>
+        <w:lastRenderedPageBreak/>
+        <w:drawing>
+          <wp:anchor distT="0" distB="0" distL="114300" distR="114300" simplePos="0" relativeHeight="251664384" behindDoc="0" locked="0" layoutInCell="1" allowOverlap="1" wp14:anchorId="1B216E95" wp14:editId="6C9C1761">
+            <wp:simplePos x="0" y="0"/>
+            <wp:positionH relativeFrom="margin">
+              <wp:posOffset>19050</wp:posOffset>
+            </wp:positionH>
+            <wp:positionV relativeFrom="paragraph">
+              <wp:posOffset>3143250</wp:posOffset>
+            </wp:positionV>
+            <wp:extent cx="5381625" cy="2667000"/>
+            <wp:effectExtent l="0" t="0" r="9525" b="0"/>
+            <wp:wrapNone/>
+            <wp:docPr id="3" name="Picture 3" descr="C:\Users\Students\Documents\GitHub\College_Lab_Works_BIM\BIM 4th Sem\OS\Lab_3\Output\priority_scheduling.png"/>
+            <wp:cNvGraphicFramePr>
+              <a:graphicFrameLocks xmlns:a="http://schemas.openxmlformats.org/drawingml/2006/main" noChangeAspect="1"/>
+            </wp:cNvGraphicFramePr>
+            <a:graphic xmlns:a="http://schemas.openxmlformats.org/drawingml/2006/main">
+              <a:graphicData uri="http://schemas.openxmlformats.org/drawingml/2006/picture">
+                <pic:pic xmlns:pic="http://schemas.openxmlformats.org/drawingml/2006/picture">
+                  <pic:nvPicPr>
+                    <pic:cNvPr id="0" name="Picture 3" descr="C:\Users\Students\Documents\GitHub\College_Lab_Works_BIM\BIM 4th Sem\OS\Lab_3\Output\priority_scheduling.png"/>
+                    <pic:cNvPicPr>
+                      <a:picLocks noChangeAspect="1" noChangeArrowheads="1"/>
+                    </pic:cNvPicPr>
+                  </pic:nvPicPr>
+                  <pic:blipFill>
+                    <a:blip r:embed="rId9">
+                      <a:extLst>
+                        <a:ext uri="{28A0092B-C50C-407E-A947-70E740481C1C}">
+                          <a14:useLocalDpi xmlns:a14="http://schemas.microsoft.com/office/drawing/2010/main" val="0"/>
+                        </a:ext>
+                      </a:extLst>
+                    </a:blip>
+                    <a:srcRect/>
+                    <a:stretch>
+                      <a:fillRect/>
+                    </a:stretch>
+                  </pic:blipFill>
+                  <pic:spPr bwMode="auto">
+                    <a:xfrm>
+                      <a:off x="0" y="0"/>
+                      <a:ext cx="5381625" cy="2667000"/>
+                    </a:xfrm>
+                    <a:prstGeom prst="rect">
+                      <a:avLst/>
+                    </a:prstGeom>
+                    <a:noFill/>
+                    <a:ln>
+                      <a:noFill/>
+                    </a:ln>
+                  </pic:spPr>
+                </pic:pic>
+              </a:graphicData>
+            </a:graphic>
+            <wp14:sizeRelH relativeFrom="page">
+              <wp14:pctWidth>0</wp14:pctWidth>
+            </wp14:sizeRelH>
+            <wp14:sizeRelV relativeFrom="page">
+              <wp14:pctHeight>0</wp14:pctHeight>
+            </wp14:sizeRelV>
+          </wp:anchor>
+        </w:drawing>
+      </w:r>
+      <w:r>
+        <w:drawing>
+          <wp:anchor distT="0" distB="0" distL="114300" distR="114300" simplePos="0" relativeHeight="251665408" behindDoc="0" locked="0" layoutInCell="1" allowOverlap="1" wp14:anchorId="32CD651D" wp14:editId="0CACCD20">
+            <wp:simplePos x="0" y="0"/>
+            <wp:positionH relativeFrom="column">
+              <wp:posOffset>0</wp:posOffset>
+            </wp:positionH>
+            <wp:positionV relativeFrom="paragraph">
+              <wp:posOffset>0</wp:posOffset>
+            </wp:positionV>
+            <wp:extent cx="5495925" cy="3000375"/>
+            <wp:effectExtent l="0" t="0" r="9525" b="9525"/>
+            <wp:wrapNone/>
+            <wp:docPr id="2" name="Picture 2" descr="C:\Users\Students\Documents\GitHub\College_Lab_Works_BIM\BIM 4th Sem\OS\Lab_3\Output\highest_response.png"/>
+            <wp:cNvGraphicFramePr>
+              <a:graphicFrameLocks xmlns:a="http://schemas.openxmlformats.org/drawingml/2006/main" noChangeAspect="1"/>
+            </wp:cNvGraphicFramePr>
+            <a:graphic xmlns:a="http://schemas.openxmlformats.org/drawingml/2006/main">
+              <a:graphicData uri="http://schemas.openxmlformats.org/drawingml/2006/picture">
+                <pic:pic xmlns:pic="http://schemas.openxmlformats.org/drawingml/2006/picture">
+                  <pic:nvPicPr>
+                    <pic:cNvPr id="0" name="Picture 2" descr="C:\Users\Students\Documents\GitHub\College_Lab_Works_BIM\BIM 4th Sem\OS\Lab_3\Output\highest_response.png"/>
+                    <pic:cNvPicPr>
+                      <a:picLocks noChangeAspect="1" noChangeArrowheads="1"/>
+                    </pic:cNvPicPr>
+                  </pic:nvPicPr>
+                  <pic:blipFill>
+                    <a:blip r:embed="rId10">
+                      <a:extLst>
+                        <a:ext uri="{28A0092B-C50C-407E-A947-70E740481C1C}">
+                          <a14:useLocalDpi xmlns:a14="http://schemas.microsoft.com/office/drawing/2010/main" val="0"/>
+                        </a:ext>
+                      </a:extLst>
+                    </a:blip>
+                    <a:srcRect/>
+                    <a:stretch>
+                      <a:fillRect/>
+                    </a:stretch>
+                  </pic:blipFill>
+                  <pic:spPr bwMode="auto">
+                    <a:xfrm>
+                      <a:off x="0" y="0"/>
+                      <a:ext cx="5495925" cy="3000375"/>
+                    </a:xfrm>
+                    <a:prstGeom prst="rect">
+                      <a:avLst/>
+                    </a:prstGeom>
+                    <a:noFill/>
+                    <a:ln>
+                      <a:noFill/>
+                    </a:ln>
+                  </pic:spPr>
+                </pic:pic>
+              </a:graphicData>
+            </a:graphic>
+            <wp14:sizeRelH relativeFrom="page">
+              <wp14:pctWidth>0</wp14:pctWidth>
+            </wp14:sizeRelH>
+            <wp14:sizeRelV relativeFrom="page">
+              <wp14:pctHeight>0</wp14:pctHeight>
+            </wp14:sizeRelV>
+          </wp:anchor>
+        </w:drawing>
+      </w:r>
+      <w:r>
+        <w:drawing>
+          <wp:anchor distT="0" distB="0" distL="114300" distR="114300" simplePos="0" relativeHeight="251666432" behindDoc="0" locked="0" layoutInCell="1" allowOverlap="1" wp14:anchorId="026019BA" wp14:editId="3BC7A041">
+            <wp:simplePos x="0" y="0"/>
+            <wp:positionH relativeFrom="page">
+              <wp:posOffset>933450</wp:posOffset>
+            </wp:positionH>
+            <wp:positionV relativeFrom="paragraph">
+              <wp:posOffset>5924550</wp:posOffset>
+            </wp:positionV>
+            <wp:extent cx="5581650" cy="2971800"/>
+            <wp:effectExtent l="0" t="0" r="0" b="0"/>
+            <wp:wrapNone/>
+            <wp:docPr id="1" name="Picture 1" descr="C:\Users\Students\Documents\GitHub\College_Lab_Works_BIM\BIM 4th Sem\OS\Lab_3\Output\FCFS_P.png"/>
+            <wp:cNvGraphicFramePr>
+              <a:graphicFrameLocks xmlns:a="http://schemas.openxmlformats.org/drawingml/2006/main" noChangeAspect="1"/>
+            </wp:cNvGraphicFramePr>
+            <a:graphic xmlns:a="http://schemas.openxmlformats.org/drawingml/2006/main">
+              <a:graphicData uri="http://schemas.openxmlformats.org/drawingml/2006/picture">
+                <pic:pic xmlns:pic="http://schemas.openxmlformats.org/drawingml/2006/picture">
+                  <pic:nvPicPr>
+                    <pic:cNvPr id="0" name="Picture 1" descr="C:\Users\Students\Documents\GitHub\College_Lab_Works_BIM\BIM 4th Sem\OS\Lab_3\Output\FCFS_P.png"/>
+                    <pic:cNvPicPr>
+                      <a:picLocks noChangeAspect="1" noChangeArrowheads="1"/>
+                    </pic:cNvPicPr>
+                  </pic:nvPicPr>
+                  <pic:blipFill>
+                    <a:blip r:embed="rId11">
+                      <a:extLst>
+                        <a:ext uri="{28A0092B-C50C-407E-A947-70E740481C1C}">
+                          <a14:useLocalDpi xmlns:a14="http://schemas.microsoft.com/office/drawing/2010/main" val="0"/>
+                        </a:ext>
+                      </a:extLst>
+                    </a:blip>
+                    <a:srcRect/>
+                    <a:stretch>
+                      <a:fillRect/>
+                    </a:stretch>
+                  </pic:blipFill>
+                  <pic:spPr bwMode="auto">
+                    <a:xfrm>
+                      <a:off x="0" y="0"/>
+                      <a:ext cx="5581650" cy="2971800"/>
+                    </a:xfrm>
+                    <a:prstGeom prst="rect">
+                      <a:avLst/>
+                    </a:prstGeom>
+                    <a:noFill/>
+                    <a:ln>
+                      <a:noFill/>
+                    </a:ln>
+                  </pic:spPr>
+                </pic:pic>
+              </a:graphicData>
+            </a:graphic>
+            <wp14:sizeRelH relativeFrom="page">
+              <wp14:pctWidth>0</wp14:pctWidth>
+            </wp14:sizeRelH>
+            <wp14:sizeRelV relativeFrom="page">
+              <wp14:pctHeight>0</wp14:pctHeight>
+            </wp14:sizeRelV>
+          </wp:anchor>
+        </w:drawing>
+      </w:r>
+    </w:p>
+    <w:p>
+      <w:r>
+        <w:br w:type="page"/>
+      </w:r>
+    </w:p>
+    <w:p>
+      <w:r>
+        <w:rPr>
+          <w:noProof/>
+        </w:rPr>
+        <w:lastRenderedPageBreak/>
+        <w:drawing>
+          <wp:anchor distT="0" distB="0" distL="114300" distR="114300" simplePos="0" relativeHeight="251668480" behindDoc="0" locked="0" layoutInCell="1" allowOverlap="1" wp14:anchorId="1789AAF0" wp14:editId="176F80D2">
+            <wp:simplePos x="0" y="0"/>
+            <wp:positionH relativeFrom="column">
+              <wp:posOffset>2625962</wp:posOffset>
+            </wp:positionH>
+            <wp:positionV relativeFrom="paragraph">
+              <wp:posOffset>-712795</wp:posOffset>
+            </wp:positionV>
+            <wp:extent cx="3296093" cy="1510030"/>
+            <wp:effectExtent l="0" t="0" r="0" b="0"/>
+            <wp:wrapNone/>
+            <wp:docPr id="10" name="Picture 10" descr="C:\Users\Students\Documents\GitHub\College_Lab_Works_BIM\BIM 4th Sem\OS\Lab_4\Output\Screenshot 2025-08-29 125859.png"/>
+            <wp:cNvGraphicFramePr>
+              <a:graphicFrameLocks xmlns:a="http://schemas.openxmlformats.org/drawingml/2006/main" noChangeAspect="1"/>
+            </wp:cNvGraphicFramePr>
+            <a:graphic xmlns:a="http://schemas.openxmlformats.org/drawingml/2006/main">
+              <a:graphicData uri="http://schemas.openxmlformats.org/drawingml/2006/picture">
+                <pic:pic xmlns:pic="http://schemas.openxmlformats.org/drawingml/2006/picture">
+                  <pic:nvPicPr>
+                    <pic:cNvPr id="0" name="Picture 10" descr="C:\Users\Students\Documents\GitHub\College_Lab_Works_BIM\BIM 4th Sem\OS\Lab_4\Output\Screenshot 2025-08-29 125859.png"/>
+                    <pic:cNvPicPr>
+                      <a:picLocks noChangeAspect="1" noChangeArrowheads="1"/>
+                    </pic:cNvPicPr>
+                  </pic:nvPicPr>
+                  <pic:blipFill>
+                    <a:blip r:embed="rId12">
+                      <a:extLst>
+                        <a:ext uri="{28A0092B-C50C-407E-A947-70E740481C1C}">
+                          <a14:useLocalDpi xmlns:a14="http://schemas.microsoft.com/office/drawing/2010/main" val="0"/>
+                        </a:ext>
+                      </a:extLst>
+                    </a:blip>
+                    <a:srcRect/>
+                    <a:stretch>
+                      <a:fillRect/>
+                    </a:stretch>
+                  </pic:blipFill>
+                  <pic:spPr bwMode="auto">
+                    <a:xfrm>
+                      <a:off x="0" y="0"/>
+                      <a:ext cx="3296093" cy="1510030"/>
+                    </a:xfrm>
+                    <a:prstGeom prst="rect">
+                      <a:avLst/>
+                    </a:prstGeom>
+                    <a:noFill/>
+                    <a:ln>
+                      <a:noFill/>
+                    </a:ln>
+                  </pic:spPr>
+                </pic:pic>
+              </a:graphicData>
+            </a:graphic>
+            <wp14:sizeRelH relativeFrom="page">
+              <wp14:pctWidth>0</wp14:pctWidth>
+            </wp14:sizeRelH>
+            <wp14:sizeRelV relativeFrom="page">
+              <wp14:pctHeight>0</wp14:pctHeight>
+            </wp14:sizeRelV>
+          </wp:anchor>
+        </w:drawing>
+      </w:r>
+      <w:r>
+        <w:rPr>
+          <w:noProof/>
+        </w:rPr>
+        <w:drawing>
+          <wp:anchor distT="0" distB="0" distL="114300" distR="114300" simplePos="0" relativeHeight="251671552" behindDoc="0" locked="0" layoutInCell="1" allowOverlap="1" wp14:anchorId="0E52FA14" wp14:editId="20507FE0">
+            <wp:simplePos x="0" y="0"/>
+            <wp:positionH relativeFrom="column">
+              <wp:posOffset>-478819</wp:posOffset>
+            </wp:positionH>
+            <wp:positionV relativeFrom="paragraph">
+              <wp:posOffset>-702015</wp:posOffset>
+            </wp:positionV>
+            <wp:extent cx="2923954" cy="2998470"/>
+            <wp:effectExtent l="0" t="0" r="0" b="0"/>
+            <wp:wrapNone/>
+            <wp:docPr id="7" name="Picture 7" descr="C:\Users\Students\Documents\GitHub\College_Lab_Works_BIM\BIM 4th Sem\OS\Lab_4\Output\Screenshot 2025-08-29 125946.png"/>
+            <wp:cNvGraphicFramePr>
+              <a:graphicFrameLocks xmlns:a="http://schemas.openxmlformats.org/drawingml/2006/main" noChangeAspect="1"/>
+            </wp:cNvGraphicFramePr>
+            <a:graphic xmlns:a="http://schemas.openxmlformats.org/drawingml/2006/main">
+              <a:graphicData uri="http://schemas.openxmlformats.org/drawingml/2006/picture">
+                <pic:pic xmlns:pic="http://schemas.openxmlformats.org/drawingml/2006/picture">
+                  <pic:nvPicPr>
+                    <pic:cNvPr id="0" name="Picture 7" descr="C:\Users\Students\Documents\GitHub\College_Lab_Works_BIM\BIM 4th Sem\OS\Lab_4\Output\Screenshot 2025-08-29 125946.png"/>
+                    <pic:cNvPicPr>
+                      <a:picLocks noChangeAspect="1" noChangeArrowheads="1"/>
+                    </pic:cNvPicPr>
+                  </pic:nvPicPr>
+                  <pic:blipFill>
+                    <a:blip r:embed="rId13">
+                      <a:extLst>
+                        <a:ext uri="{28A0092B-C50C-407E-A947-70E740481C1C}">
+                          <a14:useLocalDpi xmlns:a14="http://schemas.microsoft.com/office/drawing/2010/main" val="0"/>
+                        </a:ext>
+                      </a:extLst>
+                    </a:blip>
+                    <a:srcRect/>
+                    <a:stretch>
+                      <a:fillRect/>
+                    </a:stretch>
+                  </pic:blipFill>
+                  <pic:spPr bwMode="auto">
+                    <a:xfrm>
+                      <a:off x="0" y="0"/>
+                      <a:ext cx="2923954" cy="2998470"/>
+                    </a:xfrm>
+                    <a:prstGeom prst="rect">
+                      <a:avLst/>
+                    </a:prstGeom>
+                    <a:noFill/>
+                    <a:ln>
+                      <a:noFill/>
+                    </a:ln>
+                  </pic:spPr>
+                </pic:pic>
+              </a:graphicData>
+            </a:graphic>
+            <wp14:sizeRelH relativeFrom="page">
+              <wp14:pctWidth>0</wp14:pctWidth>
+            </wp14:sizeRelH>
+            <wp14:sizeRelV relativeFrom="page">
+              <wp14:pctHeight>0</wp14:pctHeight>
+            </wp14:sizeRelV>
+          </wp:anchor>
+        </w:drawing>
+      </w:r>
+    </w:p>
+    <w:p>
+      <w:r>
+        <w:rPr>
+          <w:noProof/>
+        </w:rPr>
+        <w:drawing>
+          <wp:anchor distT="0" distB="0" distL="114300" distR="114300" simplePos="0" relativeHeight="251672576" behindDoc="0" locked="0" layoutInCell="1" allowOverlap="1" wp14:anchorId="7A89C577" wp14:editId="12694DC9">
+            <wp:simplePos x="0" y="0"/>
+            <wp:positionH relativeFrom="column">
+              <wp:posOffset>3922749</wp:posOffset>
+            </wp:positionH>
+            <wp:positionV relativeFrom="paragraph">
+              <wp:posOffset>6401612</wp:posOffset>
+            </wp:positionV>
+            <wp:extent cx="2519916" cy="1956435"/>
+            <wp:effectExtent l="0" t="0" r="0" b="5715"/>
+            <wp:wrapNone/>
+            <wp:docPr id="19" name="Picture 19" descr="C:\Users\Students\Documents\GitHub\College_Lab_Works_BIM\BIM 4th Sem\OS\Lab_5\Output\worst_fit.png"/>
+            <wp:cNvGraphicFramePr>
+              <a:graphicFrameLocks xmlns:a="http://schemas.openxmlformats.org/drawingml/2006/main" noChangeAspect="1"/>
+            </wp:cNvGraphicFramePr>
+            <a:graphic xmlns:a="http://schemas.openxmlformats.org/drawingml/2006/main">
+              <a:graphicData uri="http://schemas.openxmlformats.org/drawingml/2006/picture">
+                <pic:pic xmlns:pic="http://schemas.openxmlformats.org/drawingml/2006/picture">
+                  <pic:nvPicPr>
+                    <pic:cNvPr id="0" name="Picture 19" descr="C:\Users\Students\Documents\GitHub\College_Lab_Works_BIM\BIM 4th Sem\OS\Lab_5\Output\worst_fit.png"/>
+                    <pic:cNvPicPr>
+                      <a:picLocks noChangeAspect="1" noChangeArrowheads="1"/>
+                    </pic:cNvPicPr>
+                  </pic:nvPicPr>
+                  <pic:blipFill>
+                    <a:blip r:embed="rId14">
+                      <a:extLst>
+                        <a:ext uri="{28A0092B-C50C-407E-A947-70E740481C1C}">
+                          <a14:useLocalDpi xmlns:a14="http://schemas.microsoft.com/office/drawing/2010/main" val="0"/>
+                        </a:ext>
+                      </a:extLst>
+                    </a:blip>
+                    <a:srcRect/>
+                    <a:stretch>
+                      <a:fillRect/>
+                    </a:stretch>
+                  </pic:blipFill>
+                  <pic:spPr bwMode="auto">
+                    <a:xfrm>
+                      <a:off x="0" y="0"/>
+                      <a:ext cx="2519916" cy="1956435"/>
+                    </a:xfrm>
+                    <a:prstGeom prst="rect">
+                      <a:avLst/>
+                    </a:prstGeom>
+                    <a:noFill/>
+                    <a:ln>
+                      <a:noFill/>
+                    </a:ln>
+                  </pic:spPr>
+                </pic:pic>
+              </a:graphicData>
+            </a:graphic>
+            <wp14:sizeRelH relativeFrom="page">
+              <wp14:pctWidth>0</wp14:pctWidth>
+            </wp14:sizeRelH>
+            <wp14:sizeRelV relativeFrom="page">
+              <wp14:pctHeight>0</wp14:pctHeight>
+            </wp14:sizeRelV>
+          </wp:anchor>
+        </w:drawing>
+      </w:r>
+      <w:r>
+        <w:rPr>
+          <w:noProof/>
+        </w:rPr>
+        <w:drawing>
+          <wp:anchor distT="0" distB="0" distL="114300" distR="114300" simplePos="0" relativeHeight="251676672" behindDoc="0" locked="0" layoutInCell="1" allowOverlap="1" wp14:anchorId="575D7A7F" wp14:editId="38313CE5">
+            <wp:simplePos x="0" y="0"/>
+            <wp:positionH relativeFrom="margin">
+              <wp:posOffset>-691294</wp:posOffset>
+            </wp:positionH>
+            <wp:positionV relativeFrom="paragraph">
+              <wp:posOffset>5093645</wp:posOffset>
+            </wp:positionV>
+            <wp:extent cx="4455042" cy="2795905"/>
+            <wp:effectExtent l="0" t="0" r="3175" b="4445"/>
+            <wp:wrapNone/>
+            <wp:docPr id="13" name="Picture 13" descr="C:\Users\Students\Documents\GitHub\College_Lab_Works_BIM\BIM 4th Sem\OS\Lab_5\Output\CSCAN.png"/>
+            <wp:cNvGraphicFramePr>
+              <a:graphicFrameLocks xmlns:a="http://schemas.openxmlformats.org/drawingml/2006/main" noChangeAspect="1"/>
+            </wp:cNvGraphicFramePr>
+            <a:graphic xmlns:a="http://schemas.openxmlformats.org/drawingml/2006/main">
+              <a:graphicData uri="http://schemas.openxmlformats.org/drawingml/2006/picture">
+                <pic:pic xmlns:pic="http://schemas.openxmlformats.org/drawingml/2006/picture">
+                  <pic:nvPicPr>
+                    <pic:cNvPr id="0" name="Picture 13" descr="C:\Users\Students\Documents\GitHub\College_Lab_Works_BIM\BIM 4th Sem\OS\Lab_5\Output\CSCAN.png"/>
+                    <pic:cNvPicPr>
+                      <a:picLocks noChangeAspect="1" noChangeArrowheads="1"/>
+                    </pic:cNvPicPr>
+                  </pic:nvPicPr>
+                  <pic:blipFill>
+                    <a:blip r:embed="rId15">
+                      <a:extLst>
+                        <a:ext uri="{28A0092B-C50C-407E-A947-70E740481C1C}">
+                          <a14:useLocalDpi xmlns:a14="http://schemas.microsoft.com/office/drawing/2010/main" val="0"/>
+                        </a:ext>
+                      </a:extLst>
+                    </a:blip>
+                    <a:srcRect/>
+                    <a:stretch>
+                      <a:fillRect/>
+                    </a:stretch>
+                  </pic:blipFill>
+                  <pic:spPr bwMode="auto">
+                    <a:xfrm>
+                      <a:off x="0" y="0"/>
+                      <a:ext cx="4455042" cy="2795905"/>
+                    </a:xfrm>
+                    <a:prstGeom prst="rect">
+                      <a:avLst/>
+                    </a:prstGeom>
+                    <a:noFill/>
+                    <a:ln>
+                      <a:noFill/>
+                    </a:ln>
+                  </pic:spPr>
+                </pic:pic>
+              </a:graphicData>
+            </a:graphic>
+            <wp14:sizeRelH relativeFrom="page">
+              <wp14:pctWidth>0</wp14:pctWidth>
+            </wp14:sizeRelH>
+            <wp14:sizeRelV relativeFrom="page">
+              <wp14:pctHeight>0</wp14:pctHeight>
+            </wp14:sizeRelV>
+          </wp:anchor>
+        </w:drawing>
+      </w:r>
+      <w:r>
+        <w:rPr>
+          <w:noProof/>
+        </w:rPr>
+        <w:drawing>
+          <wp:anchor distT="0" distB="0" distL="114300" distR="114300" simplePos="0" relativeHeight="251667456" behindDoc="0" locked="0" layoutInCell="1" allowOverlap="1" wp14:anchorId="18417D04" wp14:editId="2365C48B">
+            <wp:simplePos x="0" y="0"/>
+            <wp:positionH relativeFrom="column">
+              <wp:posOffset>2689830</wp:posOffset>
+            </wp:positionH>
+            <wp:positionV relativeFrom="paragraph">
+              <wp:posOffset>670722</wp:posOffset>
+            </wp:positionV>
+            <wp:extent cx="3051175" cy="2317897"/>
+            <wp:effectExtent l="0" t="0" r="0" b="6350"/>
+            <wp:wrapNone/>
+            <wp:docPr id="11" name="Picture 11" descr="C:\Users\Students\Documents\GitHub\College_Lab_Works_BIM\BIM 4th Sem\OS\Lab_4\Output\Screenshot 2025-08-29 125922.png"/>
+            <wp:cNvGraphicFramePr>
+              <a:graphicFrameLocks xmlns:a="http://schemas.openxmlformats.org/drawingml/2006/main" noChangeAspect="1"/>
+            </wp:cNvGraphicFramePr>
+            <a:graphic xmlns:a="http://schemas.openxmlformats.org/drawingml/2006/main">
+              <a:graphicData uri="http://schemas.openxmlformats.org/drawingml/2006/picture">
+                <pic:pic xmlns:pic="http://schemas.openxmlformats.org/drawingml/2006/picture">
+                  <pic:nvPicPr>
+                    <pic:cNvPr id="0" name="Picture 11" descr="C:\Users\Students\Documents\GitHub\College_Lab_Works_BIM\BIM 4th Sem\OS\Lab_4\Output\Screenshot 2025-08-29 125922.png"/>
+                    <pic:cNvPicPr>
+                      <a:picLocks noChangeAspect="1" noChangeArrowheads="1"/>
+                    </pic:cNvPicPr>
+                  </pic:nvPicPr>
+                  <pic:blipFill>
+                    <a:blip r:embed="rId16">
+                      <a:extLst>
+                        <a:ext uri="{28A0092B-C50C-407E-A947-70E740481C1C}">
+                          <a14:useLocalDpi xmlns:a14="http://schemas.microsoft.com/office/drawing/2010/main" val="0"/>
+                        </a:ext>
+                      </a:extLst>
+                    </a:blip>
+                    <a:srcRect/>
+                    <a:stretch>
+                      <a:fillRect/>
+                    </a:stretch>
+                  </pic:blipFill>
+                  <pic:spPr bwMode="auto">
+                    <a:xfrm>
+                      <a:off x="0" y="0"/>
+                      <a:ext cx="3051175" cy="2317897"/>
+                    </a:xfrm>
+                    <a:prstGeom prst="rect">
+                      <a:avLst/>
+                    </a:prstGeom>
+                    <a:noFill/>
+                    <a:ln>
+                      <a:noFill/>
+                    </a:ln>
+                  </pic:spPr>
+                </pic:pic>
+              </a:graphicData>
+            </a:graphic>
+            <wp14:sizeRelH relativeFrom="page">
+              <wp14:pctWidth>0</wp14:pctWidth>
+            </wp14:sizeRelH>
+            <wp14:sizeRelV relativeFrom="page">
+              <wp14:pctHeight>0</wp14:pctHeight>
+            </wp14:sizeRelV>
+          </wp:anchor>
+        </w:drawing>
+      </w:r>
+      <w:r>
+        <w:rPr>
+          <w:noProof/>
+        </w:rPr>
+        <w:drawing>
+          <wp:anchor distT="0" distB="0" distL="114300" distR="114300" simplePos="0" relativeHeight="251670528" behindDoc="0" locked="0" layoutInCell="1" allowOverlap="1" wp14:anchorId="1231C3EB" wp14:editId="1A35C36C">
+            <wp:simplePos x="0" y="0"/>
+            <wp:positionH relativeFrom="column">
+              <wp:posOffset>2636402</wp:posOffset>
+            </wp:positionH>
+            <wp:positionV relativeFrom="paragraph">
+              <wp:posOffset>3243757</wp:posOffset>
+            </wp:positionV>
+            <wp:extent cx="3625702" cy="2976880"/>
+            <wp:effectExtent l="0" t="0" r="0" b="0"/>
+            <wp:wrapNone/>
+            <wp:docPr id="8" name="Picture 8" descr="C:\Users\Students\Documents\GitHub\College_Lab_Works_BIM\BIM 4th Sem\OS\Lab_4\Output\Screenshot 2025-08-29 125736.png"/>
+            <wp:cNvGraphicFramePr>
+              <a:graphicFrameLocks xmlns:a="http://schemas.openxmlformats.org/drawingml/2006/main" noChangeAspect="1"/>
+            </wp:cNvGraphicFramePr>
+            <a:graphic xmlns:a="http://schemas.openxmlformats.org/drawingml/2006/main">
+              <a:graphicData uri="http://schemas.openxmlformats.org/drawingml/2006/picture">
+                <pic:pic xmlns:pic="http://schemas.openxmlformats.org/drawingml/2006/picture">
+                  <pic:nvPicPr>
+                    <pic:cNvPr id="0" name="Picture 8" descr="C:\Users\Students\Documents\GitHub\College_Lab_Works_BIM\BIM 4th Sem\OS\Lab_4\Output\Screenshot 2025-08-29 125736.png"/>
+                    <pic:cNvPicPr>
+                      <a:picLocks noChangeAspect="1" noChangeArrowheads="1"/>
+                    </pic:cNvPicPr>
+                  </pic:nvPicPr>
+                  <pic:blipFill>
+                    <a:blip r:embed="rId17">
+                      <a:extLst>
+                        <a:ext uri="{28A0092B-C50C-407E-A947-70E740481C1C}">
+                          <a14:useLocalDpi xmlns:a14="http://schemas.microsoft.com/office/drawing/2010/main" val="0"/>
+                        </a:ext>
+                      </a:extLst>
+                    </a:blip>
+                    <a:srcRect/>
+                    <a:stretch>
+                      <a:fillRect/>
+                    </a:stretch>
+                  </pic:blipFill>
+                  <pic:spPr bwMode="auto">
+                    <a:xfrm>
+                      <a:off x="0" y="0"/>
+                      <a:ext cx="3625702" cy="2976880"/>
+                    </a:xfrm>
+                    <a:prstGeom prst="rect">
+                      <a:avLst/>
+                    </a:prstGeom>
+                    <a:noFill/>
+                    <a:ln>
+                      <a:noFill/>
+                    </a:ln>
+                  </pic:spPr>
+                </pic:pic>
+              </a:graphicData>
+            </a:graphic>
+            <wp14:sizeRelH relativeFrom="page">
+              <wp14:pctWidth>0</wp14:pctWidth>
+            </wp14:sizeRelH>
+            <wp14:sizeRelV relativeFrom="page">
+              <wp14:pctHeight>0</wp14:pctHeight>
+            </wp14:sizeRelV>
+          </wp:anchor>
+        </w:drawing>
+      </w:r>
+      <w:r>
+        <w:rPr>
+          <w:noProof/>
+        </w:rPr>
+        <w:drawing>
+          <wp:anchor distT="0" distB="0" distL="114300" distR="114300" simplePos="0" relativeHeight="251669504" behindDoc="0" locked="0" layoutInCell="1" allowOverlap="1" wp14:anchorId="1B96D0CA" wp14:editId="03D4A4F6">
+            <wp:simplePos x="0" y="0"/>
+            <wp:positionH relativeFrom="column">
+              <wp:posOffset>-499966</wp:posOffset>
+            </wp:positionH>
+            <wp:positionV relativeFrom="paragraph">
+              <wp:posOffset>2169913</wp:posOffset>
+            </wp:positionV>
+            <wp:extent cx="3051544" cy="2881385"/>
+            <wp:effectExtent l="0" t="0" r="0" b="0"/>
+            <wp:wrapNone/>
+            <wp:docPr id="9" name="Picture 9" descr="C:\Users\Students\Documents\GitHub\College_Lab_Works_BIM\BIM 4th Sem\OS\Lab_4\Output\Screenshot 2025-08-29 125814.png"/>
+            <wp:cNvGraphicFramePr>
+              <a:graphicFrameLocks xmlns:a="http://schemas.openxmlformats.org/drawingml/2006/main" noChangeAspect="1"/>
+            </wp:cNvGraphicFramePr>
+            <a:graphic xmlns:a="http://schemas.openxmlformats.org/drawingml/2006/main">
+              <a:graphicData uri="http://schemas.openxmlformats.org/drawingml/2006/picture">
+                <pic:pic xmlns:pic="http://schemas.openxmlformats.org/drawingml/2006/picture">
+                  <pic:nvPicPr>
+                    <pic:cNvPr id="0" name="Picture 9" descr="C:\Users\Students\Documents\GitHub\College_Lab_Works_BIM\BIM 4th Sem\OS\Lab_4\Output\Screenshot 2025-08-29 125814.png"/>
+                    <pic:cNvPicPr>
+                      <a:picLocks noChangeAspect="1" noChangeArrowheads="1"/>
+                    </pic:cNvPicPr>
+                  </pic:nvPicPr>
+                  <pic:blipFill>
+                    <a:blip r:embed="rId18">
+                      <a:extLst>
+                        <a:ext uri="{28A0092B-C50C-407E-A947-70E740481C1C}">
+                          <a14:useLocalDpi xmlns:a14="http://schemas.microsoft.com/office/drawing/2010/main" val="0"/>
+                        </a:ext>
+                      </a:extLst>
+                    </a:blip>
+                    <a:srcRect/>
+                    <a:stretch>
+                      <a:fillRect/>
+                    </a:stretch>
+                  </pic:blipFill>
+                  <pic:spPr bwMode="auto">
+                    <a:xfrm>
+                      <a:off x="0" y="0"/>
+                      <a:ext cx="3051544" cy="2881385"/>
+                    </a:xfrm>
+                    <a:prstGeom prst="rect">
+                      <a:avLst/>
+                    </a:prstGeom>
+                    <a:noFill/>
+                    <a:ln>
+                      <a:noFill/>
+                    </a:ln>
+                  </pic:spPr>
+                </pic:pic>
+              </a:graphicData>
+            </a:graphic>
+            <wp14:sizeRelH relativeFrom="page">
+              <wp14:pctWidth>0</wp14:pctWidth>
+            </wp14:sizeRelH>
+            <wp14:sizeRelV relativeFrom="page">
+              <wp14:pctHeight>0</wp14:pctHeight>
+            </wp14:sizeRelV>
+          </wp:anchor>
+        </w:drawing>
+      </w:r>
+      <w:r>
+        <w:br w:type="page"/>
+      </w:r>
+    </w:p>
+    <w:p>
+      <w:r>
+        <w:rPr>
+          <w:noProof/>
+        </w:rPr>
+        <w:lastRenderedPageBreak/>
+        <w:drawing>
+          <wp:anchor distT="0" distB="0" distL="114300" distR="114300" simplePos="0" relativeHeight="251678720" behindDoc="0" locked="0" layoutInCell="1" allowOverlap="1" wp14:anchorId="532935E2" wp14:editId="6F050E38">
+            <wp:simplePos x="0" y="0"/>
+            <wp:positionH relativeFrom="column">
+              <wp:posOffset>-382226</wp:posOffset>
+            </wp:positionH>
+            <wp:positionV relativeFrom="paragraph">
+              <wp:posOffset>-319331</wp:posOffset>
+            </wp:positionV>
+            <wp:extent cx="3561907" cy="3253140"/>
+            <wp:effectExtent l="0" t="0" r="635" b="4445"/>
+            <wp:wrapNone/>
+            <wp:docPr id="14" name="Picture 14" descr="C:\Users\Students\Documents\GitHub\College_Lab_Works_BIM\BIM 4th Sem\OS\Lab_5\Output\FCFS.png"/>
+            <wp:cNvGraphicFramePr>
+              <a:graphicFrameLocks xmlns:a="http://schemas.openxmlformats.org/drawingml/2006/main" noChangeAspect="1"/>
+            </wp:cNvGraphicFramePr>
+            <a:graphic xmlns:a="http://schemas.openxmlformats.org/drawingml/2006/main">
+              <a:graphicData uri="http://schemas.openxmlformats.org/drawingml/2006/picture">
+                <pic:pic xmlns:pic="http://schemas.openxmlformats.org/drawingml/2006/picture">
+                  <pic:nvPicPr>
+                    <pic:cNvPr id="0" name="Picture 14" descr="C:\Users\Students\Documents\GitHub\College_Lab_Works_BIM\BIM 4th Sem\OS\Lab_5\Output\FCFS.png"/>
+                    <pic:cNvPicPr>
+                      <a:picLocks noChangeAspect="1" noChangeArrowheads="1"/>
+                    </pic:cNvPicPr>
+                  </pic:nvPicPr>
+                  <pic:blipFill>
+                    <a:blip r:embed="rId19">
+                      <a:extLst>
+                        <a:ext uri="{28A0092B-C50C-407E-A947-70E740481C1C}">
+                          <a14:useLocalDpi xmlns:a14="http://schemas.microsoft.com/office/drawing/2010/main" val="0"/>
+                        </a:ext>
+                      </a:extLst>
+                    </a:blip>
+                    <a:srcRect/>
+                    <a:stretch>
+                      <a:fillRect/>
+                    </a:stretch>
+                  </pic:blipFill>
+                  <pic:spPr bwMode="auto">
+                    <a:xfrm>
+                      <a:off x="0" y="0"/>
+                      <a:ext cx="3561907" cy="3253140"/>
+                    </a:xfrm>
+                    <a:prstGeom prst="rect">
+                      <a:avLst/>
+                    </a:prstGeom>
+                    <a:noFill/>
+                    <a:ln>
+                      <a:noFill/>
+                    </a:ln>
+                  </pic:spPr>
+                </pic:pic>
+              </a:graphicData>
+            </a:graphic>
+            <wp14:sizeRelH relativeFrom="page">
+              <wp14:pctWidth>0</wp14:pctWidth>
+            </wp14:sizeRelH>
+            <wp14:sizeRelV relativeFrom="page">
+              <wp14:pctHeight>0</wp14:pctHeight>
+            </wp14:sizeRelV>
+          </wp:anchor>
+        </w:drawing>
+      </w:r>
+      <w:r>
+        <w:rPr>
+          <w:noProof/>
+        </w:rPr>
+        <w:drawing>
+          <wp:anchor distT="0" distB="0" distL="114300" distR="114300" simplePos="0" relativeHeight="251675648" behindDoc="0" locked="0" layoutInCell="1" allowOverlap="1" wp14:anchorId="203B9EF8" wp14:editId="2A4E4119">
+            <wp:simplePos x="0" y="0"/>
+            <wp:positionH relativeFrom="margin">
+              <wp:posOffset>2848876</wp:posOffset>
+            </wp:positionH>
+            <wp:positionV relativeFrom="paragraph">
+              <wp:posOffset>-1551408</wp:posOffset>
+            </wp:positionV>
+            <wp:extent cx="3721396" cy="2711450"/>
+            <wp:effectExtent l="0" t="0" r="0" b="0"/>
+            <wp:wrapNone/>
+            <wp:docPr id="16" name="Picture 16" descr="C:\Users\Students\Documents\GitHub\College_Lab_Works_BIM\BIM 4th Sem\OS\Lab_5\Output\lookup.png"/>
+            <wp:cNvGraphicFramePr>
+              <a:graphicFrameLocks xmlns:a="http://schemas.openxmlformats.org/drawingml/2006/main" noChangeAspect="1"/>
+            </wp:cNvGraphicFramePr>
+            <a:graphic xmlns:a="http://schemas.openxmlformats.org/drawingml/2006/main">
+              <a:graphicData uri="http://schemas.openxmlformats.org/drawingml/2006/picture">
+                <pic:pic xmlns:pic="http://schemas.openxmlformats.org/drawingml/2006/picture">
+                  <pic:nvPicPr>
+                    <pic:cNvPr id="0" name="Picture 16" descr="C:\Users\Students\Documents\GitHub\College_Lab_Works_BIM\BIM 4th Sem\OS\Lab_5\Output\lookup.png"/>
+                    <pic:cNvPicPr>
+                      <a:picLocks noChangeAspect="1" noChangeArrowheads="1"/>
+                    </pic:cNvPicPr>
+                  </pic:nvPicPr>
+                  <pic:blipFill>
+                    <a:blip r:embed="rId20">
+                      <a:extLst>
+                        <a:ext uri="{28A0092B-C50C-407E-A947-70E740481C1C}">
+                          <a14:useLocalDpi xmlns:a14="http://schemas.microsoft.com/office/drawing/2010/main" val="0"/>
+                        </a:ext>
+                      </a:extLst>
+                    </a:blip>
+                    <a:srcRect/>
+                    <a:stretch>
+                      <a:fillRect/>
+                    </a:stretch>
+                  </pic:blipFill>
+                  <pic:spPr bwMode="auto">
+                    <a:xfrm>
+                      <a:off x="0" y="0"/>
+                      <a:ext cx="3721396" cy="2711450"/>
+                    </a:xfrm>
+                    <a:prstGeom prst="rect">
+                      <a:avLst/>
+                    </a:prstGeom>
+                    <a:noFill/>
+                    <a:ln>
+                      <a:noFill/>
+                    </a:ln>
+                  </pic:spPr>
+                </pic:pic>
+              </a:graphicData>
+            </a:graphic>
+            <wp14:sizeRelH relativeFrom="page">
+              <wp14:pctWidth>0</wp14:pctWidth>
+            </wp14:sizeRelH>
+            <wp14:sizeRelV relativeFrom="page">
+              <wp14:pctHeight>0</wp14:pctHeight>
+            </wp14:sizeRelV>
+          </wp:anchor>
+        </w:drawing>
+      </w:r>
+      <w:r>
+        <w:rPr>
+          <w:noProof/>
+        </w:rPr>
+        <w:drawing>
+          <wp:anchor distT="0" distB="0" distL="114300" distR="114300" simplePos="0" relativeHeight="251679744" behindDoc="0" locked="0" layoutInCell="1" allowOverlap="1" wp14:anchorId="17242DFB" wp14:editId="6204BE1D">
+            <wp:simplePos x="0" y="0"/>
+            <wp:positionH relativeFrom="column">
+              <wp:posOffset>-382772</wp:posOffset>
+            </wp:positionH>
+            <wp:positionV relativeFrom="paragraph">
+              <wp:posOffset>-669851</wp:posOffset>
+            </wp:positionV>
+            <wp:extent cx="3136265" cy="2094865"/>
+            <wp:effectExtent l="0" t="0" r="6985" b="635"/>
+            <wp:wrapNone/>
+            <wp:docPr id="12" name="Picture 12" descr="C:\Users\Students\Documents\GitHub\College_Lab_Works_BIM\BIM 4th Sem\OS\Lab_5\Output\best_fit.png"/>
+            <wp:cNvGraphicFramePr>
+              <a:graphicFrameLocks xmlns:a="http://schemas.openxmlformats.org/drawingml/2006/main" noChangeAspect="1"/>
+            </wp:cNvGraphicFramePr>
+            <a:graphic xmlns:a="http://schemas.openxmlformats.org/drawingml/2006/main">
+              <a:graphicData uri="http://schemas.openxmlformats.org/drawingml/2006/picture">
+                <pic:pic xmlns:pic="http://schemas.openxmlformats.org/drawingml/2006/picture">
+                  <pic:nvPicPr>
+                    <pic:cNvPr id="0" name="Picture 12" descr="C:\Users\Students\Documents\GitHub\College_Lab_Works_BIM\BIM 4th Sem\OS\Lab_5\Output\best_fit.png"/>
+                    <pic:cNvPicPr>
+                      <a:picLocks noChangeAspect="1" noChangeArrowheads="1"/>
+                    </pic:cNvPicPr>
+                  </pic:nvPicPr>
+                  <pic:blipFill>
+                    <a:blip r:embed="rId21">
+                      <a:extLst>
+                        <a:ext uri="{28A0092B-C50C-407E-A947-70E740481C1C}">
+                          <a14:useLocalDpi xmlns:a14="http://schemas.microsoft.com/office/drawing/2010/main" val="0"/>
+                        </a:ext>
+                      </a:extLst>
+                    </a:blip>
+                    <a:srcRect/>
+                    <a:stretch>
+                      <a:fillRect/>
+                    </a:stretch>
+                  </pic:blipFill>
+                  <pic:spPr bwMode="auto">
+                    <a:xfrm>
+                      <a:off x="0" y="0"/>
+                      <a:ext cx="3136265" cy="2094865"/>
+                    </a:xfrm>
+                    <a:prstGeom prst="rect">
+                      <a:avLst/>
+                    </a:prstGeom>
+                    <a:noFill/>
+                    <a:ln>
+                      <a:noFill/>
+                    </a:ln>
+                  </pic:spPr>
+                </pic:pic>
+              </a:graphicData>
+            </a:graphic>
+            <wp14:sizeRelH relativeFrom="page">
+              <wp14:pctWidth>0</wp14:pctWidth>
+            </wp14:sizeRelH>
+            <wp14:sizeRelV relativeFrom="page">
+              <wp14:pctHeight>0</wp14:pctHeight>
+            </wp14:sizeRelV>
+          </wp:anchor>
+        </w:drawing>
+      </w:r>
+    </w:p>
+    <w:p/>
+    <w:p>
       <w:bookmarkStart w:id="0" w:name="_GoBack"/>
       <w:bookmarkEnd w:id="0"/>
+      <w:r>
+        <w:rPr>
+          <w:noProof/>
+        </w:rPr>
+        <w:drawing>
+          <wp:anchor distT="0" distB="0" distL="114300" distR="114300" simplePos="0" relativeHeight="251673600" behindDoc="0" locked="0" layoutInCell="1" allowOverlap="1" wp14:anchorId="3E2D6594" wp14:editId="6E9EBFDF">
+            <wp:simplePos x="0" y="0"/>
+            <wp:positionH relativeFrom="column">
+              <wp:posOffset>-457200</wp:posOffset>
+            </wp:positionH>
+            <wp:positionV relativeFrom="paragraph">
+              <wp:posOffset>4138723</wp:posOffset>
+            </wp:positionV>
+            <wp:extent cx="3710763" cy="1753235"/>
+            <wp:effectExtent l="0" t="0" r="4445" b="0"/>
+            <wp:wrapNone/>
+            <wp:docPr id="18" name="Picture 18" descr="C:\Users\Students\Documents\GitHub\College_Lab_Works_BIM\BIM 4th Sem\OS\Lab_5\Output\STSF.png"/>
+            <wp:cNvGraphicFramePr>
+              <a:graphicFrameLocks xmlns:a="http://schemas.openxmlformats.org/drawingml/2006/main" noChangeAspect="1"/>
+            </wp:cNvGraphicFramePr>
+            <a:graphic xmlns:a="http://schemas.openxmlformats.org/drawingml/2006/main">
+              <a:graphicData uri="http://schemas.openxmlformats.org/drawingml/2006/picture">
+                <pic:pic xmlns:pic="http://schemas.openxmlformats.org/drawingml/2006/picture">
+                  <pic:nvPicPr>
+                    <pic:cNvPr id="0" name="Picture 18" descr="C:\Users\Students\Documents\GitHub\College_Lab_Works_BIM\BIM 4th Sem\OS\Lab_5\Output\STSF.png"/>
+                    <pic:cNvPicPr>
+                      <a:picLocks noChangeAspect="1" noChangeArrowheads="1"/>
+                    </pic:cNvPicPr>
+                  </pic:nvPicPr>
+                  <pic:blipFill>
+                    <a:blip r:embed="rId22">
+                      <a:extLst>
+                        <a:ext uri="{28A0092B-C50C-407E-A947-70E740481C1C}">
+                          <a14:useLocalDpi xmlns:a14="http://schemas.microsoft.com/office/drawing/2010/main" val="0"/>
+                        </a:ext>
+                      </a:extLst>
+                    </a:blip>
+                    <a:srcRect/>
+                    <a:stretch>
+                      <a:fillRect/>
+                    </a:stretch>
+                  </pic:blipFill>
+                  <pic:spPr bwMode="auto">
+                    <a:xfrm>
+                      <a:off x="0" y="0"/>
+                      <a:ext cx="3715050" cy="1755260"/>
+                    </a:xfrm>
+                    <a:prstGeom prst="rect">
+                      <a:avLst/>
+                    </a:prstGeom>
+                    <a:noFill/>
+                    <a:ln>
+                      <a:noFill/>
+                    </a:ln>
+                  </pic:spPr>
+                </pic:pic>
+              </a:graphicData>
+            </a:graphic>
+            <wp14:sizeRelH relativeFrom="page">
+              <wp14:pctWidth>0</wp14:pctWidth>
+            </wp14:sizeRelH>
+            <wp14:sizeRelV relativeFrom="page">
+              <wp14:pctHeight>0</wp14:pctHeight>
+            </wp14:sizeRelV>
+          </wp:anchor>
+        </w:drawing>
+      </w:r>
+      <w:r>
+        <w:rPr>
+          <w:noProof/>
+        </w:rPr>
+        <w:drawing>
+          <wp:anchor distT="0" distB="0" distL="114300" distR="114300" simplePos="0" relativeHeight="251677696" behindDoc="0" locked="0" layoutInCell="1" allowOverlap="1" wp14:anchorId="1C72FD1A" wp14:editId="02648E37">
+            <wp:simplePos x="0" y="0"/>
+            <wp:positionH relativeFrom="margin">
+              <wp:posOffset>-446213</wp:posOffset>
+            </wp:positionH>
+            <wp:positionV relativeFrom="paragraph">
+              <wp:posOffset>2681679</wp:posOffset>
+            </wp:positionV>
+            <wp:extent cx="3678865" cy="1711874"/>
+            <wp:effectExtent l="0" t="0" r="0" b="3175"/>
+            <wp:wrapNone/>
+            <wp:docPr id="17" name="Picture 17" descr="C:\Users\Students\Documents\GitHub\College_Lab_Works_BIM\BIM 4th Sem\OS\Lab_5\Output\SCAN.png"/>
+            <wp:cNvGraphicFramePr>
+              <a:graphicFrameLocks xmlns:a="http://schemas.openxmlformats.org/drawingml/2006/main" noChangeAspect="1"/>
+            </wp:cNvGraphicFramePr>
+            <a:graphic xmlns:a="http://schemas.openxmlformats.org/drawingml/2006/main">
+              <a:graphicData uri="http://schemas.openxmlformats.org/drawingml/2006/picture">
+                <pic:pic xmlns:pic="http://schemas.openxmlformats.org/drawingml/2006/picture">
+                  <pic:nvPicPr>
+                    <pic:cNvPr id="0" name="Picture 17" descr="C:\Users\Students\Documents\GitHub\College_Lab_Works_BIM\BIM 4th Sem\OS\Lab_5\Output\SCAN.png"/>
+                    <pic:cNvPicPr>
+                      <a:picLocks noChangeAspect="1" noChangeArrowheads="1"/>
+                    </pic:cNvPicPr>
+                  </pic:nvPicPr>
+                  <pic:blipFill>
+                    <a:blip r:embed="rId23">
+                      <a:extLst>
+                        <a:ext uri="{28A0092B-C50C-407E-A947-70E740481C1C}">
+                          <a14:useLocalDpi xmlns:a14="http://schemas.microsoft.com/office/drawing/2010/main" val="0"/>
+                        </a:ext>
+                      </a:extLst>
+                    </a:blip>
+                    <a:srcRect/>
+                    <a:stretch>
+                      <a:fillRect/>
+                    </a:stretch>
+                  </pic:blipFill>
+                  <pic:spPr bwMode="auto">
+                    <a:xfrm>
+                      <a:off x="0" y="0"/>
+                      <a:ext cx="3678865" cy="1711874"/>
+                    </a:xfrm>
+                    <a:prstGeom prst="rect">
+                      <a:avLst/>
+                    </a:prstGeom>
+                    <a:noFill/>
+                    <a:ln>
+                      <a:noFill/>
+                    </a:ln>
+                  </pic:spPr>
+                </pic:pic>
+              </a:graphicData>
+            </a:graphic>
+            <wp14:sizeRelH relativeFrom="page">
+              <wp14:pctWidth>0</wp14:pctWidth>
+            </wp14:sizeRelH>
+            <wp14:sizeRelV relativeFrom="page">
+              <wp14:pctHeight>0</wp14:pctHeight>
+            </wp14:sizeRelV>
+          </wp:anchor>
+        </w:drawing>
+      </w:r>
+      <w:r>
+        <w:rPr>
+          <w:noProof/>
+        </w:rPr>
+        <w:drawing>
+          <wp:anchor distT="0" distB="0" distL="114300" distR="114300" simplePos="0" relativeHeight="251674624" behindDoc="0" locked="0" layoutInCell="1" allowOverlap="1" wp14:anchorId="2F17A076" wp14:editId="3873A15D">
+            <wp:simplePos x="0" y="0"/>
+            <wp:positionH relativeFrom="margin">
+              <wp:posOffset>3317225</wp:posOffset>
+            </wp:positionH>
+            <wp:positionV relativeFrom="paragraph">
+              <wp:posOffset>13290</wp:posOffset>
+            </wp:positionV>
+            <wp:extent cx="3189767" cy="2966720"/>
+            <wp:effectExtent l="0" t="0" r="0" b="5080"/>
+            <wp:wrapNone/>
+            <wp:docPr id="15" name="Picture 15" descr="C:\Users\Students\Documents\GitHub\College_Lab_Works_BIM\BIM 4th Sem\OS\Lab_5\Output\first_fit.png"/>
+            <wp:cNvGraphicFramePr>
+              <a:graphicFrameLocks xmlns:a="http://schemas.openxmlformats.org/drawingml/2006/main" noChangeAspect="1"/>
+            </wp:cNvGraphicFramePr>
+            <a:graphic xmlns:a="http://schemas.openxmlformats.org/drawingml/2006/main">
+              <a:graphicData uri="http://schemas.openxmlformats.org/drawingml/2006/picture">
+                <pic:pic xmlns:pic="http://schemas.openxmlformats.org/drawingml/2006/picture">
+                  <pic:nvPicPr>
+                    <pic:cNvPr id="0" name="Picture 15" descr="C:\Users\Students\Documents\GitHub\College_Lab_Works_BIM\BIM 4th Sem\OS\Lab_5\Output\first_fit.png"/>
+                    <pic:cNvPicPr>
+                      <a:picLocks noChangeAspect="1" noChangeArrowheads="1"/>
+                    </pic:cNvPicPr>
+                  </pic:nvPicPr>
+                  <pic:blipFill>
+                    <a:blip r:embed="rId24">
+                      <a:extLst>
+                        <a:ext uri="{28A0092B-C50C-407E-A947-70E740481C1C}">
+                          <a14:useLocalDpi xmlns:a14="http://schemas.microsoft.com/office/drawing/2010/main" val="0"/>
+                        </a:ext>
+                      </a:extLst>
+                    </a:blip>
+                    <a:srcRect/>
+                    <a:stretch>
+                      <a:fillRect/>
+                    </a:stretch>
+                  </pic:blipFill>
+                  <pic:spPr bwMode="auto">
+                    <a:xfrm>
+                      <a:off x="0" y="0"/>
+                      <a:ext cx="3189767" cy="2966720"/>
+                    </a:xfrm>
+                    <a:prstGeom prst="rect">
+                      <a:avLst/>
+                    </a:prstGeom>
+                    <a:noFill/>
+                    <a:ln>
+                      <a:noFill/>
+                    </a:ln>
+                  </pic:spPr>
+                </pic:pic>
+              </a:graphicData>
+            </a:graphic>
+            <wp14:sizeRelH relativeFrom="page">
+              <wp14:pctWidth>0</wp14:pctWidth>
+            </wp14:sizeRelH>
+            <wp14:sizeRelV relativeFrom="page">
+              <wp14:pctHeight>0</wp14:pctHeight>
+            </wp14:sizeRelV>
+          </wp:anchor>
+        </w:drawing>
+      </w:r>
     </w:p>
     <w:sectPr>
       <w:pgSz w:w="12240" w:h="15840"/>
@@ -14,6 +1305,56 @@
     </w:sectPr>
   </w:body>
 </w:document>
+</file>
+
+<file path=word/endnotes.xml><?xml version="1.0" encoding="utf-8"?>
+<w:endnotes xmlns:wpc="http://schemas.microsoft.com/office/word/2010/wordprocessingCanvas" xmlns:cx="http://schemas.microsoft.com/office/drawing/2014/chartex" xmlns:mc="http://schemas.openxmlformats.org/markup-compatibility/2006" xmlns:o="urn:schemas-microsoft-com:office:office" xmlns:r="http://schemas.openxmlformats.org/officeDocument/2006/relationships" xmlns:m="http://schemas.openxmlformats.org/officeDocument/2006/math" xmlns:v="urn:schemas-microsoft-com:vml" xmlns:wp14="http://schemas.microsoft.com/office/word/2010/wordprocessingDrawing" xmlns:wp="http://schemas.openxmlformats.org/drawingml/2006/wordprocessingDrawing" xmlns:w10="urn:schemas-microsoft-com:office:word" xmlns:w="http://schemas.openxmlformats.org/wordprocessingml/2006/main" xmlns:w14="http://schemas.microsoft.com/office/word/2010/wordml" xmlns:w15="http://schemas.microsoft.com/office/word/2012/wordml" xmlns:w16se="http://schemas.microsoft.com/office/word/2015/wordml/symex" xmlns:wpg="http://schemas.microsoft.com/office/word/2010/wordprocessingGroup" xmlns:wpi="http://schemas.microsoft.com/office/word/2010/wordprocessingInk" xmlns:wne="http://schemas.microsoft.com/office/word/2006/wordml" xmlns:wps="http://schemas.microsoft.com/office/word/2010/wordprocessingShape" mc:Ignorable="w14 w15 w16se wp14">
+  <w:endnote w:type="separator" w:id="-1">
+    <w:p>
+      <w:pPr>
+        <w:spacing w:after="0" w:line="240" w:lineRule="auto"/>
+      </w:pPr>
+      <w:r>
+        <w:separator/>
+      </w:r>
+    </w:p>
+  </w:endnote>
+  <w:endnote w:type="continuationSeparator" w:id="0">
+    <w:p>
+      <w:pPr>
+        <w:spacing w:after="0" w:line="240" w:lineRule="auto"/>
+      </w:pPr>
+      <w:r>
+        <w:continuationSeparator/>
+      </w:r>
+    </w:p>
+  </w:endnote>
+</w:endnotes>
+</file>
+
+<file path=word/footnotes.xml><?xml version="1.0" encoding="utf-8"?>
+<w:footnotes xmlns:wpc="http://schemas.microsoft.com/office/word/2010/wordprocessingCanvas" xmlns:cx="http://schemas.microsoft.com/office/drawing/2014/chartex" xmlns:mc="http://schemas.openxmlformats.org/markup-compatibility/2006" xmlns:o="urn:schemas-microsoft-com:office:office" xmlns:r="http://schemas.openxmlformats.org/officeDocument/2006/relationships" xmlns:m="http://schemas.openxmlformats.org/officeDocument/2006/math" xmlns:v="urn:schemas-microsoft-com:vml" xmlns:wp14="http://schemas.microsoft.com/office/word/2010/wordprocessingDrawing" xmlns:wp="http://schemas.openxmlformats.org/drawingml/2006/wordprocessingDrawing" xmlns:w10="urn:schemas-microsoft-com:office:word" xmlns:w="http://schemas.openxmlformats.org/wordprocessingml/2006/main" xmlns:w14="http://schemas.microsoft.com/office/word/2010/wordml" xmlns:w15="http://schemas.microsoft.com/office/word/2012/wordml" xmlns:w16se="http://schemas.microsoft.com/office/word/2015/wordml/symex" xmlns:wpg="http://schemas.microsoft.com/office/word/2010/wordprocessingGroup" xmlns:wpi="http://schemas.microsoft.com/office/word/2010/wordprocessingInk" xmlns:wne="http://schemas.microsoft.com/office/word/2006/wordml" xmlns:wps="http://schemas.microsoft.com/office/word/2010/wordprocessingShape" mc:Ignorable="w14 w15 w16se wp14">
+  <w:footnote w:type="separator" w:id="-1">
+    <w:p>
+      <w:pPr>
+        <w:spacing w:after="0" w:line="240" w:lineRule="auto"/>
+      </w:pPr>
+      <w:r>
+        <w:separator/>
+      </w:r>
+    </w:p>
+  </w:footnote>
+  <w:footnote w:type="continuationSeparator" w:id="0">
+    <w:p>
+      <w:pPr>
+        <w:spacing w:after="0" w:line="240" w:lineRule="auto"/>
+      </w:pPr>
+      <w:r>
+        <w:continuationSeparator/>
+      </w:r>
+    </w:p>
+  </w:footnote>
+</w:footnotes>
 </file>
 
 <file path=word/styles.xml><?xml version="1.0" encoding="utf-8"?>
@@ -437,6 +1778,50 @@
     <w:semiHidden/>
     <w:unhideWhenUsed/>
   </w:style>
+  <w:style w:type="paragraph" w:styleId="Header">
+    <w:name w:val="header"/>
+    <w:basedOn w:val="Normal"/>
+    <w:link w:val="HeaderChar"/>
+    <w:uiPriority w:val="99"/>
+    <w:unhideWhenUsed/>
+    <w:rsid w:val="003D236E"/>
+    <w:pPr>
+      <w:tabs>
+        <w:tab w:val="center" w:pos="4680"/>
+        <w:tab w:val="right" w:pos="9360"/>
+      </w:tabs>
+      <w:spacing w:after="0" w:line="240" w:lineRule="auto"/>
+    </w:pPr>
+  </w:style>
+  <w:style w:type="character" w:customStyle="1" w:styleId="HeaderChar">
+    <w:name w:val="Header Char"/>
+    <w:basedOn w:val="DefaultParagraphFont"/>
+    <w:link w:val="Header"/>
+    <w:uiPriority w:val="99"/>
+    <w:rsid w:val="003D236E"/>
+  </w:style>
+  <w:style w:type="paragraph" w:styleId="Footer">
+    <w:name w:val="footer"/>
+    <w:basedOn w:val="Normal"/>
+    <w:link w:val="FooterChar"/>
+    <w:uiPriority w:val="99"/>
+    <w:unhideWhenUsed/>
+    <w:rsid w:val="003D236E"/>
+    <w:pPr>
+      <w:tabs>
+        <w:tab w:val="center" w:pos="4680"/>
+        <w:tab w:val="right" w:pos="9360"/>
+      </w:tabs>
+      <w:spacing w:after="0" w:line="240" w:lineRule="auto"/>
+    </w:pPr>
+  </w:style>
+  <w:style w:type="character" w:customStyle="1" w:styleId="FooterChar">
+    <w:name w:val="Footer Char"/>
+    <w:basedOn w:val="DefaultParagraphFont"/>
+    <w:link w:val="Footer"/>
+    <w:uiPriority w:val="99"/>
+    <w:rsid w:val="003D236E"/>
+  </w:style>
 </w:styles>
 </file>
 

</xml_diff>